<commit_message>
Adaptar la puerta de calidad a un repositorio sin protección de rama y registrar el Project #1
Co-Authored-By: Claude Opus 5.5 <noreply@anthropic.com>
</commit_message>
<xml_diff>
--- a/.claude/harness/profile/entregables/documento-arquitectura.docx
+++ b/.claude/harness/profile/entregables/documento-arquitectura.docx
@@ -2741,7 +2741,7 @@
     <w:tr>
       <w:tc>
         <w:tcPr>
-          <w:tcW w:type="dxa" w:w="793"/>
+          <w:tcW w:type="dxa" w:w="680"/>
           <w:tcBorders>
             <w:top w:val="single" w:sz="8" w:color="E8505B"/>
           </w:tcBorders>
@@ -2785,7 +2785,7 @@
       </w:tc>
       <w:tc>
         <w:tcPr>
-          <w:tcW w:type="dxa" w:w="3969"/>
+          <w:tcW w:type="dxa" w:w="3628"/>
           <w:tcBorders>
             <w:top w:val="single" w:sz="8" w:color="E8505B"/>
           </w:tcBorders>
@@ -2807,7 +2807,7 @@
       </w:tc>
       <w:tc>
         <w:tcPr>
-          <w:tcW w:type="dxa" w:w="1247"/>
+          <w:tcW w:type="dxa" w:w="1701"/>
           <w:tcBorders>
             <w:top w:val="single" w:sz="8" w:color="E8505B"/>
           </w:tcBorders>

</xml_diff>

<commit_message>
Adaptar el harness a Claude Code y GitHub con protección de rama (#2)
* Adaptar la puerta de calidad a un repositorio sin protección de rama y registrar el Project #1

Co-Authored-By: Claude Opus 5.5 <noreply@anthropic.com>

* Documentar la protección de rama y la aprobación de PROD tras publicar el repositorio #1

Co-Authored-By: Claude Opus 5.5 <noreply@anthropic.com>

* Completar la puerta de calidad y comprobar la revisión de CodeRabbit sobre el HEAD #1

Co-Authored-By: Claude Opus 5.5 <noreply@anthropic.com>

---------

Co-authored-by: Claude Opus 5.5 <noreply@anthropic.com>
</commit_message>
<xml_diff>
--- a/.claude/harness/profile/entregables/documento-arquitectura.docx
+++ b/.claude/harness/profile/entregables/documento-arquitectura.docx
@@ -2741,7 +2741,7 @@
     <w:tr>
       <w:tc>
         <w:tcPr>
-          <w:tcW w:type="dxa" w:w="793"/>
+          <w:tcW w:type="dxa" w:w="680"/>
           <w:tcBorders>
             <w:top w:val="single" w:sz="8" w:color="E8505B"/>
           </w:tcBorders>
@@ -2785,7 +2785,7 @@
       </w:tc>
       <w:tc>
         <w:tcPr>
-          <w:tcW w:type="dxa" w:w="3969"/>
+          <w:tcW w:type="dxa" w:w="3628"/>
           <w:tcBorders>
             <w:top w:val="single" w:sz="8" w:color="E8505B"/>
           </w:tcBorders>
@@ -2807,7 +2807,7 @@
       </w:tc>
       <w:tc>
         <w:tcPr>
-          <w:tcW w:type="dxa" w:w="1247"/>
+          <w:tcW w:type="dxa" w:w="1701"/>
           <w:tcBorders>
             <w:top w:val="single" w:sz="8" w:color="E8505B"/>
           </w:tcBorders>

</xml_diff>